<commit_message>
Update next steps doc with QR code link to MLRI help page
</commit_message>
<xml_diff>
--- a/docassemble/MLRILettertoDCFforADA/data/templates/Next_Steps_for_DCF_ADA_Request.docx
+++ b/docassemble/MLRILettertoDCFforADA/data/templates/Next_Steps_for_DCF_ADA_Request.docx
@@ -375,13 +375,7 @@
         <w:pStyle w:val="Heading2"/>
       </w:pPr>
       <w:r>
-        <w:t xml:space="preserve">What do I do if DCF </w:t>
-      </w:r>
-      <w:r>
-        <w:t>says no to my request</w:t>
-      </w:r>
-      <w:r>
-        <w:t>?</w:t>
+        <w:t>What do I do if DCF says no to my request?</w:t>
       </w:r>
     </w:p>
     <w:p>
@@ -429,6 +423,82 @@
       </w:r>
     </w:p>
     <w:p/>
+    <w:p/>
+    <w:p/>
+    <w:p/>
+    <w:p/>
+    <w:p>
+      <w:r>
+        <w:t xml:space="preserve">Learn more: </w:t>
+      </w:r>
+      <w:hyperlink r:id="rId17" w:history="1">
+        <w:r>
+          <w:rPr>
+            <w:rStyle w:val="Hyperlink"/>
+          </w:rPr>
+          <w:t>https://www.masslegalhelp.org/children-families-divorce/department-children-and-families-dcf/disability-rights-dcf</w:t>
+        </w:r>
+      </w:hyperlink>
+      <w:r>
+        <w:t xml:space="preserve"> or scan the QR Code below:</w:t>
+      </w:r>
+    </w:p>
+    <w:p/>
+    <w:p>
+      <w:r>
+        <w:rPr>
+          <w:noProof/>
+        </w:rPr>
+        <w:drawing>
+          <wp:inline distT="0" distB="0" distL="0" distR="0" wp14:anchorId="40068A22" wp14:editId="29C1302F">
+            <wp:extent cx="960120" cy="960120"/>
+            <wp:effectExtent l="0" t="0" r="0" b="0"/>
+            <wp:docPr id="2107105131" name="Picture 1" descr="QR Code Image"/>
+            <wp:cNvGraphicFramePr>
+              <a:graphicFrameLocks xmlns:a="http://schemas.openxmlformats.org/drawingml/2006/main" noChangeAspect="1"/>
+            </wp:cNvGraphicFramePr>
+            <a:graphic xmlns:a="http://schemas.openxmlformats.org/drawingml/2006/main">
+              <a:graphicData uri="http://schemas.openxmlformats.org/drawingml/2006/picture">
+                <pic:pic xmlns:pic="http://schemas.openxmlformats.org/drawingml/2006/picture">
+                  <pic:nvPicPr>
+                    <pic:cNvPr id="0" name="Picture 1" descr="QR Code Image"/>
+                    <pic:cNvPicPr>
+                      <a:picLocks noChangeAspect="1" noChangeArrowheads="1"/>
+                    </pic:cNvPicPr>
+                  </pic:nvPicPr>
+                  <pic:blipFill>
+                    <a:blip r:embed="rId18" cstate="print">
+                      <a:extLst>
+                        <a:ext uri="{28A0092B-C50C-407E-A947-70E740481C1C}">
+                          <a14:useLocalDpi xmlns:a14="http://schemas.microsoft.com/office/drawing/2010/main" val="0"/>
+                        </a:ext>
+                      </a:extLst>
+                    </a:blip>
+                    <a:srcRect/>
+                    <a:stretch>
+                      <a:fillRect/>
+                    </a:stretch>
+                  </pic:blipFill>
+                  <pic:spPr bwMode="auto">
+                    <a:xfrm>
+                      <a:off x="0" y="0"/>
+                      <a:ext cx="960120" cy="960120"/>
+                    </a:xfrm>
+                    <a:prstGeom prst="rect">
+                      <a:avLst/>
+                    </a:prstGeom>
+                    <a:noFill/>
+                    <a:ln>
+                      <a:noFill/>
+                    </a:ln>
+                  </pic:spPr>
+                </pic:pic>
+              </a:graphicData>
+            </a:graphic>
+          </wp:inline>
+        </w:drawing>
+      </w:r>
+    </w:p>
     <w:sectPr>
       <w:type w:val="continuous"/>
       <w:pgSz w:w="12240" w:h="15840"/>
@@ -2023,6 +2093,7 @@
   <w:style w:type="character" w:default="1" w:styleId="DefaultParagraphFont">
     <w:name w:val="Default Paragraph Font"/>
     <w:uiPriority w:val="1"/>
+    <w:semiHidden/>
     <w:unhideWhenUsed/>
   </w:style>
   <w:style w:type="table" w:default="1" w:styleId="TableNormal">
@@ -3004,4 +3075,24 @@
     </a:ext>
   </a:extLst>
 </a:theme>
+</file>
+
+<file path=word/webextensions/taskpanes.xml><?xml version="1.0" encoding="utf-8"?>
+<wetp:taskpanes xmlns:wetp="http://schemas.microsoft.com/office/webextensions/taskpanes/2010/11">
+  <wetp:taskpane dockstate="right" visibility="0" width="438" row="3">
+    <wetp:webextensionref xmlns:r="http://schemas.openxmlformats.org/officeDocument/2006/relationships" r:id="rId1"/>
+  </wetp:taskpane>
+</wetp:taskpanes>
+</file>
+
+<file path=word/webextensions/webextension1.xml><?xml version="1.0" encoding="utf-8"?>
+<we:webextension xmlns:we="http://schemas.microsoft.com/office/webextensions/webextension/2010/11" id="{21DB5A87-C311-4643-996D-F2C15DB09F4C}">
+  <we:reference id="WA104380862" version="3.0.0.0" store="Omex" storeType="OMEX"/>
+  <we:alternateReferences>
+    <we:reference id="WA104380862" version="3.0.0.0" store="WA104380862" storeType="OMEX"/>
+  </we:alternateReferences>
+  <we:properties/>
+  <we:bindings/>
+  <we:snapshot xmlns:r="http://schemas.openxmlformats.org/officeDocument/2006/relationships"/>
+</we:webextension>
 </file>
</xml_diff>